<commit_message>
Phase 2 Take 4
</commit_message>
<xml_diff>
--- a/7 - AI Prompts/For Chat.docx
+++ b/7 - AI Prompts/For Chat.docx
@@ -19,656 +19,7 @@
           <w:kern w:val="0"/>
           <w:lang w:eastAsia="en-US" w:bidi="ar-SA"/>
         </w:rPr>
-        <w:t>A</w:t>
-      </w:r>
-      <w:r>
-        <w:rPr>
-          <w:rFonts w:ascii="Times New Roman" w:eastAsia="Times New Roman" w:hAnsi="Times New Roman" w:cs="Times New Roman"/>
-          <w:kern w:val="0"/>
-          <w:lang w:eastAsia="en-US" w:bidi="ar-SA"/>
-        </w:rPr>
-        <w:t>n</w:t>
-      </w:r>
-      <w:r>
-        <w:rPr>
-          <w:rFonts w:ascii="Times New Roman" w:eastAsia="Times New Roman" w:hAnsi="Times New Roman" w:cs="Times New Roman"/>
-          <w:kern w:val="0"/>
-          <w:lang w:eastAsia="en-US" w:bidi="ar-SA"/>
-        </w:rPr>
-        <w:t xml:space="preserve"> integral of time-weighted square-error cost function was used to penalize later tracking errors more than transient ones:</w:t>
-      </w:r>
-      <w:r>
-        <w:rPr>
-          <w:rFonts w:ascii="Times New Roman" w:eastAsia="Times New Roman" w:hAnsi="Times New Roman" w:cs="Times New Roman"/>
-          <w:kern w:val="0"/>
-          <w:lang w:eastAsia="en-US" w:bidi="ar-SA"/>
-        </w:rPr>
-        <w:br/>
-      </w:r>
-      <m:oMathPara>
-        <m:oMath>
-          <m:r>
-            <w:rPr>
-              <w:rFonts w:ascii="Cambria Math" w:eastAsia="Times New Roman" w:hAnsi="Cambria Math" w:cs="Times New Roman"/>
-              <w:kern w:val="0"/>
-              <w:lang w:eastAsia="en-US" w:bidi="ar-SA"/>
-            </w:rPr>
-            <m:t>J=</m:t>
-          </m:r>
-          <m:nary>
-            <m:naryPr>
-              <m:limLoc m:val="undOvr"/>
-              <m:grow m:val="1"/>
-              <m:ctrlPr>
-                <w:rPr>
-                  <w:rFonts w:ascii="Cambria Math" w:eastAsia="Times New Roman" w:hAnsi="Cambria Math" w:cs="Times New Roman"/>
-                  <w:kern w:val="0"/>
-                  <w:lang w:eastAsia="en-US" w:bidi="ar-SA"/>
-                </w:rPr>
-              </m:ctrlPr>
-            </m:naryPr>
-            <m:sub>
-              <m:r>
-                <w:rPr>
-                  <w:rFonts w:ascii="Cambria Math" w:eastAsia="Times New Roman" w:hAnsi="Cambria Math" w:cs="Times New Roman"/>
-                  <w:kern w:val="0"/>
-                  <w:lang w:eastAsia="en-US" w:bidi="ar-SA"/>
-                </w:rPr>
-                <m:t>0</m:t>
-              </m:r>
-            </m:sub>
-            <m:sup>
-              <m:sSub>
-                <m:sSubPr>
-                  <m:ctrlPr>
-                    <w:rPr>
-                      <w:rFonts w:ascii="Cambria Math" w:eastAsia="Times New Roman" w:hAnsi="Cambria Math" w:cs="Times New Roman"/>
-                      <w:kern w:val="0"/>
-                      <w:lang w:eastAsia="en-US" w:bidi="ar-SA"/>
-                    </w:rPr>
-                  </m:ctrlPr>
-                </m:sSubPr>
-                <m:e>
-                  <m:r>
-                    <w:rPr>
-                      <w:rFonts w:ascii="Cambria Math" w:eastAsia="Times New Roman" w:hAnsi="Cambria Math" w:cs="Times New Roman"/>
-                      <w:kern w:val="0"/>
-                      <w:lang w:eastAsia="en-US" w:bidi="ar-SA"/>
-                    </w:rPr>
-                    <m:t>t</m:t>
-                  </m:r>
-                </m:e>
-                <m:sub>
-                  <m:r>
-                    <w:rPr>
-                      <w:rFonts w:ascii="Cambria Math" w:eastAsia="Times New Roman" w:hAnsi="Cambria Math" w:cs="Times New Roman"/>
-                      <w:kern w:val="0"/>
-                      <w:lang w:eastAsia="en-US" w:bidi="ar-SA"/>
-                    </w:rPr>
-                    <m:t>f</m:t>
-                  </m:r>
-                </m:sub>
-              </m:sSub>
-            </m:sup>
-            <m:e>
-              <m:r>
-                <w:rPr>
-                  <w:rFonts w:ascii="Cambria Math" w:eastAsia="Times New Roman" w:hAnsi="Cambria Math" w:cs="Times New Roman"/>
-                  <w:kern w:val="0"/>
-                  <w:lang w:eastAsia="en-US" w:bidi="ar-SA"/>
-                </w:rPr>
-                <m:t>(</m:t>
-              </m:r>
-            </m:e>
-          </m:nary>
-          <m:sSub>
-            <m:sSubPr>
-              <m:ctrlPr>
-                <w:rPr>
-                  <w:rFonts w:ascii="Cambria Math" w:eastAsia="Times New Roman" w:hAnsi="Cambria Math" w:cs="Times New Roman"/>
-                  <w:kern w:val="0"/>
-                  <w:lang w:eastAsia="en-US" w:bidi="ar-SA"/>
-                </w:rPr>
-              </m:ctrlPr>
-            </m:sSubPr>
-            <m:e>
-              <m:r>
-                <w:rPr>
-                  <w:rFonts w:ascii="Cambria Math" w:eastAsia="Times New Roman" w:hAnsi="Cambria Math" w:cs="Times New Roman"/>
-                  <w:kern w:val="0"/>
-                  <w:lang w:eastAsia="en-US" w:bidi="ar-SA"/>
-                </w:rPr>
-                <m:t>q</m:t>
-              </m:r>
-            </m:e>
-            <m:sub>
-              <m:r>
-                <w:rPr>
-                  <w:rFonts w:ascii="Cambria Math" w:eastAsia="Times New Roman" w:hAnsi="Cambria Math" w:cs="Times New Roman"/>
-                  <w:kern w:val="0"/>
-                  <w:lang w:eastAsia="en-US" w:bidi="ar-SA"/>
-                </w:rPr>
-                <m:t>e</m:t>
-              </m:r>
-            </m:sub>
-          </m:sSub>
-          <m:r>
-            <w:rPr>
-              <w:rFonts w:ascii="Cambria Math" w:eastAsia="Times New Roman" w:hAnsi="Cambria Math" w:cs="Times New Roman"/>
-              <w:kern w:val="0"/>
-              <w:lang w:eastAsia="en-US" w:bidi="ar-SA"/>
-            </w:rPr>
-            <m:t>⋅t</m:t>
-          </m:r>
-          <m:sSup>
-            <m:sSupPr>
-              <m:ctrlPr>
-                <w:rPr>
-                  <w:rFonts w:ascii="Cambria Math" w:eastAsia="Times New Roman" w:hAnsi="Cambria Math" w:cs="Times New Roman"/>
-                  <w:kern w:val="0"/>
-                  <w:lang w:eastAsia="en-US" w:bidi="ar-SA"/>
-                </w:rPr>
-              </m:ctrlPr>
-            </m:sSupPr>
-            <m:e>
-              <m:r>
-                <w:rPr>
-                  <w:rFonts w:ascii="Cambria Math" w:eastAsia="Times New Roman" w:hAnsi="Cambria Math" w:cs="Times New Roman"/>
-                  <w:kern w:val="0"/>
-                  <w:lang w:eastAsia="en-US" w:bidi="ar-SA"/>
-                </w:rPr>
-                <m:t>∥e(t)∥</m:t>
-              </m:r>
-            </m:e>
-            <m:sup>
-              <m:r>
-                <w:rPr>
-                  <w:rFonts w:ascii="Cambria Math" w:eastAsia="Times New Roman" w:hAnsi="Cambria Math" w:cs="Times New Roman"/>
-                  <w:kern w:val="0"/>
-                  <w:lang w:eastAsia="en-US" w:bidi="ar-SA"/>
-                </w:rPr>
-                <m:t>2</m:t>
-              </m:r>
-            </m:sup>
-          </m:sSup>
-          <m:r>
-            <w:rPr>
-              <w:rFonts w:ascii="Cambria Math" w:eastAsia="Times New Roman" w:hAnsi="Cambria Math" w:cs="Times New Roman"/>
-              <w:kern w:val="0"/>
-              <w:lang w:eastAsia="en-US" w:bidi="ar-SA"/>
-            </w:rPr>
-            <m:t>+</m:t>
-          </m:r>
-          <m:sSub>
-            <m:sSubPr>
-              <m:ctrlPr>
-                <w:rPr>
-                  <w:rFonts w:ascii="Cambria Math" w:eastAsia="Times New Roman" w:hAnsi="Cambria Math" w:cs="Times New Roman"/>
-                  <w:kern w:val="0"/>
-                  <w:lang w:eastAsia="en-US" w:bidi="ar-SA"/>
-                </w:rPr>
-              </m:ctrlPr>
-            </m:sSubPr>
-            <m:e>
-              <m:r>
-                <w:rPr>
-                  <w:rFonts w:ascii="Cambria Math" w:eastAsia="Times New Roman" w:hAnsi="Cambria Math" w:cs="Times New Roman"/>
-                  <w:kern w:val="0"/>
-                  <w:lang w:eastAsia="en-US" w:bidi="ar-SA"/>
-                </w:rPr>
-                <m:t>r</m:t>
-              </m:r>
-            </m:e>
-            <m:sub>
-              <m:r>
-                <w:rPr>
-                  <w:rFonts w:ascii="Cambria Math" w:eastAsia="Times New Roman" w:hAnsi="Cambria Math" w:cs="Times New Roman"/>
-                  <w:kern w:val="0"/>
-                  <w:lang w:eastAsia="en-US" w:bidi="ar-SA"/>
-                </w:rPr>
-                <m:t>u</m:t>
-              </m:r>
-            </m:sub>
-          </m:sSub>
-          <m:sSup>
-            <m:sSupPr>
-              <m:ctrlPr>
-                <w:rPr>
-                  <w:rFonts w:ascii="Cambria Math" w:eastAsia="Times New Roman" w:hAnsi="Cambria Math" w:cs="Times New Roman"/>
-                  <w:kern w:val="0"/>
-                  <w:lang w:eastAsia="en-US" w:bidi="ar-SA"/>
-                </w:rPr>
-              </m:ctrlPr>
-            </m:sSupPr>
-            <m:e>
-              <m:r>
-                <w:rPr>
-                  <w:rFonts w:ascii="Cambria Math" w:eastAsia="Times New Roman" w:hAnsi="Cambria Math" w:cs="Times New Roman"/>
-                  <w:kern w:val="0"/>
-                  <w:lang w:eastAsia="en-US" w:bidi="ar-SA"/>
-                </w:rPr>
-                <m:t>∥e(t)∥</m:t>
-              </m:r>
-            </m:e>
-            <m:sup>
-              <m:r>
-                <w:rPr>
-                  <w:rFonts w:ascii="Cambria Math" w:eastAsia="Times New Roman" w:hAnsi="Cambria Math" w:cs="Times New Roman"/>
-                  <w:kern w:val="0"/>
-                  <w:lang w:eastAsia="en-US" w:bidi="ar-SA"/>
-                </w:rPr>
-                <m:t>2</m:t>
-              </m:r>
-            </m:sup>
-          </m:sSup>
-          <m:r>
-            <w:rPr>
-              <w:rFonts w:ascii="Cambria Math" w:eastAsia="Times New Roman" w:hAnsi="Cambria Math" w:cs="Times New Roman"/>
-              <w:kern w:val="0"/>
-              <w:lang w:eastAsia="en-US" w:bidi="ar-SA"/>
-            </w:rPr>
-            <m:t>)dt+</m:t>
-          </m:r>
-          <m:sSub>
-            <m:sSubPr>
-              <m:ctrlPr>
-                <w:rPr>
-                  <w:rFonts w:ascii="Cambria Math" w:eastAsia="Times New Roman" w:hAnsi="Cambria Math" w:cs="Times New Roman"/>
-                  <w:kern w:val="0"/>
-                  <w:lang w:eastAsia="en-US" w:bidi="ar-SA"/>
-                </w:rPr>
-              </m:ctrlPr>
-            </m:sSubPr>
-            <m:e>
-              <m:r>
-                <w:rPr>
-                  <w:rFonts w:ascii="Cambria Math" w:eastAsia="Times New Roman" w:hAnsi="Cambria Math" w:cs="Times New Roman"/>
-                  <w:kern w:val="0"/>
-                  <w:lang w:eastAsia="en-US" w:bidi="ar-SA"/>
-                </w:rPr>
-                <m:t>W</m:t>
-              </m:r>
-            </m:e>
-            <m:sub>
-              <m:r>
-                <w:rPr>
-                  <w:rFonts w:ascii="Cambria Math" w:eastAsia="Times New Roman" w:hAnsi="Cambria Math" w:cs="Times New Roman"/>
-                  <w:kern w:val="0"/>
-                  <w:lang w:eastAsia="en-US" w:bidi="ar-SA"/>
-                </w:rPr>
-                <m:t>fail</m:t>
-              </m:r>
-            </m:sub>
-          </m:sSub>
-          <m:sSup>
-            <m:sSupPr>
-              <m:ctrlPr>
-                <w:rPr>
-                  <w:rFonts w:ascii="Cambria Math" w:eastAsia="Times New Roman" w:hAnsi="Cambria Math" w:cs="Times New Roman"/>
-                  <w:kern w:val="0"/>
-                  <w:lang w:eastAsia="en-US" w:bidi="ar-SA"/>
-                </w:rPr>
-              </m:ctrlPr>
-            </m:sSupPr>
-            <m:e>
-              <m:d>
-                <m:dPr>
-                  <m:ctrlPr>
-                    <w:rPr>
-                      <w:rFonts w:ascii="Cambria Math" w:eastAsia="Times New Roman" w:hAnsi="Cambria Math" w:cs="Times New Roman"/>
-                      <w:kern w:val="0"/>
-                      <w:lang w:eastAsia="en-US" w:bidi="ar-SA"/>
-                    </w:rPr>
-                  </m:ctrlPr>
-                </m:dPr>
-                <m:e>
-                  <m:sSub>
-                    <m:sSubPr>
-                      <m:ctrlPr>
-                        <w:rPr>
-                          <w:rFonts w:ascii="Cambria Math" w:eastAsia="Times New Roman" w:hAnsi="Cambria Math" w:cs="Times New Roman"/>
-                          <w:kern w:val="0"/>
-                          <w:lang w:eastAsia="en-US" w:bidi="ar-SA"/>
-                        </w:rPr>
-                      </m:ctrlPr>
-                    </m:sSubPr>
-                    <m:e>
-                      <m:r>
-                        <w:rPr>
-                          <w:rFonts w:ascii="Cambria Math" w:eastAsia="Times New Roman" w:hAnsi="Cambria Math" w:cs="Times New Roman"/>
-                          <w:kern w:val="0"/>
-                          <w:lang w:eastAsia="en-US" w:bidi="ar-SA"/>
-                        </w:rPr>
-                        <m:t>t</m:t>
-                      </m:r>
-                    </m:e>
-                    <m:sub>
-                      <m:r>
-                        <w:rPr>
-                          <w:rFonts w:ascii="Cambria Math" w:eastAsia="Times New Roman" w:hAnsi="Cambria Math" w:cs="Times New Roman"/>
-                          <w:kern w:val="0"/>
-                          <w:lang w:eastAsia="en-US" w:bidi="ar-SA"/>
-                        </w:rPr>
-                        <m:t>f</m:t>
-                      </m:r>
-                    </m:sub>
-                  </m:sSub>
-                  <m:r>
-                    <w:rPr>
-                      <w:rFonts w:ascii="Cambria Math" w:eastAsia="Times New Roman" w:hAnsi="Cambria Math" w:cs="Times New Roman"/>
-                      <w:kern w:val="0"/>
-                      <w:lang w:eastAsia="en-US" w:bidi="ar-SA"/>
-                    </w:rPr>
-                    <m:t>-t</m:t>
-                  </m:r>
-                </m:e>
-              </m:d>
-            </m:e>
-            <m:sup>
-              <m:r>
-                <w:rPr>
-                  <w:rFonts w:ascii="Cambria Math" w:eastAsia="Times New Roman" w:hAnsi="Cambria Math" w:cs="Times New Roman"/>
-                  <w:kern w:val="0"/>
-                  <w:lang w:eastAsia="en-US" w:bidi="ar-SA"/>
-                </w:rPr>
-                <m:t>2</m:t>
-              </m:r>
-            </m:sup>
-          </m:sSup>
-          <m:r>
-            <w:rPr>
-              <w:rFonts w:ascii="Cambria Math" w:eastAsia="Times New Roman" w:hAnsi="Cambria Math" w:cs="Times New Roman"/>
-              <w:kern w:val="0"/>
-              <w:lang w:eastAsia="en-US" w:bidi="ar-SA"/>
-            </w:rPr>
-            <m:t>,</m:t>
-          </m:r>
-          <m:r>
-            <w:rPr>
-              <w:rFonts w:ascii="Times New Roman" w:eastAsia="Times New Roman" w:hAnsi="Times New Roman" w:cs="Times New Roman"/>
-              <w:kern w:val="0"/>
-              <w:lang w:eastAsia="en-US" w:bidi="ar-SA"/>
-            </w:rPr>
-            <w:br/>
-          </m:r>
-        </m:oMath>
-      </m:oMathPara>
-      <w:r>
-        <w:rPr>
-          <w:rFonts w:ascii="Times New Roman" w:eastAsia="Times New Roman" w:hAnsi="Times New Roman" w:cs="Times New Roman"/>
-          <w:kern w:val="0"/>
-          <w:lang w:eastAsia="en-US" w:bidi="ar-SA"/>
-        </w:rPr>
-        <w:t xml:space="preserve">where </w:t>
-      </w:r>
-      <m:oMath>
-        <m:sSub>
-          <m:sSubPr>
-            <m:ctrlPr>
-              <w:rPr>
-                <w:rFonts w:ascii="Cambria Math" w:eastAsia="Times New Roman" w:hAnsi="Cambria Math" w:cs="Times New Roman"/>
-                <w:kern w:val="0"/>
-                <w:lang w:eastAsia="en-US" w:bidi="ar-SA"/>
-              </w:rPr>
-            </m:ctrlPr>
-          </m:sSubPr>
-          <m:e>
-            <m:r>
-              <w:rPr>
-                <w:rFonts w:ascii="Cambria Math" w:eastAsia="Times New Roman" w:hAnsi="Cambria Math" w:cs="Times New Roman"/>
-                <w:kern w:val="0"/>
-                <w:lang w:eastAsia="en-US" w:bidi="ar-SA"/>
-              </w:rPr>
-              <m:t>r</m:t>
-            </m:r>
-          </m:e>
-          <m:sub>
-            <m:r>
-              <w:rPr>
-                <w:rFonts w:ascii="Cambria Math" w:eastAsia="Times New Roman" w:hAnsi="Cambria Math" w:cs="Times New Roman"/>
-                <w:kern w:val="0"/>
-                <w:lang w:eastAsia="en-US" w:bidi="ar-SA"/>
-              </w:rPr>
-              <m:t>u</m:t>
-            </m:r>
-          </m:sub>
-        </m:sSub>
-        <m:r>
-          <w:rPr>
-            <w:rFonts w:ascii="Cambria Math" w:eastAsia="Times New Roman" w:hAnsi="Cambria Math" w:cs="Times New Roman"/>
-            <w:kern w:val="0"/>
-            <w:lang w:eastAsia="en-US" w:bidi="ar-SA"/>
-          </w:rPr>
-          <m:t>=0.2</m:t>
-        </m:r>
-      </m:oMath>
-      <w:r>
-        <w:rPr>
-          <w:rFonts w:ascii="Times New Roman" w:eastAsia="Times New Roman" w:hAnsi="Times New Roman" w:cs="Times New Roman"/>
-          <w:kern w:val="0"/>
-          <w:lang w:eastAsia="en-US" w:bidi="ar-SA"/>
-        </w:rPr>
-        <w:t xml:space="preserve">, </w:t>
-      </w:r>
-      <m:oMath>
-        <m:sSub>
-          <m:sSubPr>
-            <m:ctrlPr>
-              <w:rPr>
-                <w:rFonts w:ascii="Cambria Math" w:eastAsia="Times New Roman" w:hAnsi="Cambria Math" w:cs="Times New Roman"/>
-                <w:kern w:val="0"/>
-                <w:lang w:eastAsia="en-US" w:bidi="ar-SA"/>
-              </w:rPr>
-            </m:ctrlPr>
-          </m:sSubPr>
-          <m:e>
-            <m:r>
-              <w:rPr>
-                <w:rFonts w:ascii="Cambria Math" w:eastAsia="Times New Roman" w:hAnsi="Cambria Math" w:cs="Times New Roman"/>
-                <w:kern w:val="0"/>
-                <w:lang w:eastAsia="en-US" w:bidi="ar-SA"/>
-              </w:rPr>
-              <m:t>q</m:t>
-            </m:r>
-          </m:e>
-          <m:sub>
-            <m:r>
-              <w:rPr>
-                <w:rFonts w:ascii="Cambria Math" w:eastAsia="Times New Roman" w:hAnsi="Cambria Math" w:cs="Times New Roman"/>
-                <w:kern w:val="0"/>
-                <w:lang w:eastAsia="en-US" w:bidi="ar-SA"/>
-              </w:rPr>
-              <m:t>e</m:t>
-            </m:r>
-          </m:sub>
-        </m:sSub>
-        <m:r>
-          <w:rPr>
-            <w:rFonts w:ascii="Cambria Math" w:eastAsia="Times New Roman" w:hAnsi="Cambria Math" w:cs="Times New Roman"/>
-            <w:kern w:val="0"/>
-            <w:lang w:eastAsia="en-US" w:bidi="ar-SA"/>
-          </w:rPr>
-          <m:t>=1</m:t>
-        </m:r>
-      </m:oMath>
-      <w:r>
-        <w:rPr>
-          <w:rFonts w:ascii="Times New Roman" w:eastAsia="Times New Roman" w:hAnsi="Times New Roman" w:cs="Times New Roman"/>
-          <w:kern w:val="0"/>
-          <w:lang w:eastAsia="en-US" w:bidi="ar-SA"/>
-        </w:rPr>
-        <w:t xml:space="preserve">, and </w:t>
-      </w:r>
-      <m:oMath>
-        <m:sSub>
-          <m:sSubPr>
-            <m:ctrlPr>
-              <w:rPr>
-                <w:rFonts w:ascii="Cambria Math" w:eastAsia="Times New Roman" w:hAnsi="Cambria Math" w:cs="Times New Roman"/>
-                <w:kern w:val="0"/>
-                <w:lang w:eastAsia="en-US" w:bidi="ar-SA"/>
-              </w:rPr>
-            </m:ctrlPr>
-          </m:sSubPr>
-          <m:e>
-            <m:r>
-              <w:rPr>
-                <w:rFonts w:ascii="Cambria Math" w:eastAsia="Times New Roman" w:hAnsi="Cambria Math" w:cs="Times New Roman"/>
-                <w:kern w:val="0"/>
-                <w:lang w:eastAsia="en-US" w:bidi="ar-SA"/>
-              </w:rPr>
-              <m:t>W</m:t>
-            </m:r>
-          </m:e>
-          <m:sub>
-            <m:r>
-              <w:rPr>
-                <w:rFonts w:ascii="Cambria Math" w:eastAsia="Times New Roman" w:hAnsi="Cambria Math" w:cs="Times New Roman"/>
-                <w:kern w:val="0"/>
-                <w:lang w:eastAsia="en-US" w:bidi="ar-SA"/>
-              </w:rPr>
-              <m:t>fail</m:t>
-            </m:r>
-          </m:sub>
-        </m:sSub>
-        <m:r>
-          <w:rPr>
-            <w:rFonts w:ascii="Cambria Math" w:eastAsia="Times New Roman" w:hAnsi="Cambria Math" w:cs="Times New Roman"/>
-            <w:kern w:val="0"/>
-            <w:lang w:eastAsia="en-US" w:bidi="ar-SA"/>
-          </w:rPr>
-          <m:t>=1000</m:t>
-        </m:r>
-      </m:oMath>
-      <w:r>
-        <w:rPr>
-          <w:rFonts w:ascii="Times New Roman" w:eastAsia="Times New Roman" w:hAnsi="Times New Roman" w:cs="Times New Roman"/>
-          <w:kern w:val="0"/>
-          <w:lang w:eastAsia="en-US" w:bidi="ar-SA"/>
-        </w:rPr>
-        <w:t xml:space="preserve"> </w:t>
-      </w:r>
-      <w:r>
-        <w:rPr>
-          <w:rFonts w:ascii="Times New Roman" w:eastAsia="Times New Roman" w:hAnsi="Times New Roman" w:cs="Times New Roman"/>
-          <w:kern w:val="0"/>
-          <w:lang w:eastAsia="en-US" w:bidi="ar-SA"/>
-        </w:rPr>
-        <w:t xml:space="preserve">if the simulated drone leaves the desired space before at some </w:t>
-      </w:r>
-      <m:oMath>
-        <m:sSub>
-          <m:sSubPr>
-            <m:ctrlPr>
-              <w:rPr>
-                <w:rFonts w:ascii="Cambria Math" w:eastAsia="Times New Roman" w:hAnsi="Cambria Math" w:cs="Times New Roman"/>
-                <w:kern w:val="0"/>
-                <w:lang w:eastAsia="en-US" w:bidi="ar-SA"/>
-              </w:rPr>
-            </m:ctrlPr>
-          </m:sSubPr>
-          <m:e>
-            <m:r>
-              <w:rPr>
-                <w:rFonts w:ascii="Cambria Math" w:eastAsia="Times New Roman" w:hAnsi="Cambria Math" w:cs="Times New Roman"/>
-                <w:kern w:val="0"/>
-                <w:lang w:eastAsia="en-US" w:bidi="ar-SA"/>
-              </w:rPr>
-              <m:t>t</m:t>
-            </m:r>
-          </m:e>
-          <m:sub>
-            <m:r>
-              <w:rPr>
-                <w:rFonts w:ascii="Cambria Math" w:eastAsia="Times New Roman" w:hAnsi="Cambria Math" w:cs="Times New Roman"/>
-                <w:kern w:val="0"/>
-                <w:lang w:eastAsia="en-US" w:bidi="ar-SA"/>
-              </w:rPr>
-              <m:t>f</m:t>
-            </m:r>
-          </m:sub>
-        </m:sSub>
-      </m:oMath>
-      <w:r>
-        <w:rPr>
-          <w:rFonts w:ascii="Times New Roman" w:eastAsia="Times New Roman" w:hAnsi="Times New Roman" w:cs="Times New Roman"/>
-          <w:kern w:val="0"/>
-          <w:lang w:eastAsia="en-US" w:bidi="ar-SA"/>
-        </w:rPr>
-        <w:t xml:space="preserve">before the end of the simulation and </w:t>
-      </w:r>
-      <m:oMath>
-        <m:sSub>
-          <m:sSubPr>
-            <m:ctrlPr>
-              <w:rPr>
-                <w:rFonts w:ascii="Cambria Math" w:eastAsia="Times New Roman" w:hAnsi="Cambria Math" w:cs="Times New Roman"/>
-                <w:kern w:val="0"/>
-                <w:lang w:eastAsia="en-US" w:bidi="ar-SA"/>
-              </w:rPr>
-            </m:ctrlPr>
-          </m:sSubPr>
-          <m:e>
-            <m:r>
-              <w:rPr>
-                <w:rFonts w:ascii="Cambria Math" w:eastAsia="Times New Roman" w:hAnsi="Cambria Math" w:cs="Times New Roman"/>
-                <w:kern w:val="0"/>
-                <w:lang w:eastAsia="en-US" w:bidi="ar-SA"/>
-              </w:rPr>
-              <m:t>W</m:t>
-            </m:r>
-          </m:e>
-          <m:sub>
-            <m:r>
-              <w:rPr>
-                <w:rFonts w:ascii="Cambria Math" w:eastAsia="Times New Roman" w:hAnsi="Cambria Math" w:cs="Times New Roman"/>
-                <w:kern w:val="0"/>
-                <w:lang w:eastAsia="en-US" w:bidi="ar-SA"/>
-              </w:rPr>
-              <m:t>fail</m:t>
-            </m:r>
-          </m:sub>
-        </m:sSub>
-        <m:r>
-          <w:rPr>
-            <w:rFonts w:ascii="Cambria Math" w:eastAsia="Times New Roman" w:hAnsi="Cambria Math" w:cs="Times New Roman"/>
-            <w:kern w:val="0"/>
-            <w:lang w:eastAsia="en-US" w:bidi="ar-SA"/>
-          </w:rPr>
-          <m:t>=0</m:t>
-        </m:r>
-      </m:oMath>
-      <w:r>
-        <w:rPr>
-          <w:rFonts w:ascii="Times New Roman" w:eastAsia="Times New Roman" w:hAnsi="Times New Roman" w:cs="Times New Roman"/>
-          <w:kern w:val="0"/>
-          <w:lang w:eastAsia="en-US" w:bidi="ar-SA"/>
-        </w:rPr>
-        <w:t>otherwise. The integral was evaluated using the trapezoidal rule.</w:t>
-      </w:r>
-      <w:r>
-        <w:rPr>
-          <w:rFonts w:ascii="Times New Roman" w:eastAsia="Times New Roman" w:hAnsi="Times New Roman" w:cs="Times New Roman"/>
-          <w:kern w:val="0"/>
-          <w:lang w:eastAsia="en-US" w:bidi="ar-SA"/>
-        </w:rPr>
-        <w:t xml:space="preserve"> The same quadcopter model and initial state</w:t>
-      </w:r>
-      <w:r>
-        <w:rPr>
-          <w:rFonts w:ascii="Times New Roman" w:eastAsia="Times New Roman" w:hAnsi="Times New Roman" w:cs="Times New Roman"/>
-          <w:kern w:val="0"/>
-          <w:lang w:eastAsia="en-US" w:bidi="ar-SA"/>
-        </w:rPr>
-        <w:t xml:space="preserve"> (-2.37, -3.0)</w:t>
-      </w:r>
-      <w:r>
-        <w:rPr>
-          <w:rFonts w:ascii="Times New Roman" w:eastAsia="Times New Roman" w:hAnsi="Times New Roman" w:cs="Times New Roman"/>
-          <w:kern w:val="0"/>
-          <w:lang w:eastAsia="en-US" w:bidi="ar-SA"/>
-        </w:rPr>
-        <w:t xml:space="preserve"> were used throughout.</w:t>
+        <w:t>An integral of time-weighted square-error cost function was used to penalize later tracking errors more than transient ones:</w:t>
       </w:r>
     </w:p>
     <w:p>
@@ -682,6 +33,302 @@
           <w:lang w:eastAsia="en-US" w:bidi="ar-SA"/>
         </w:rPr>
       </w:pPr>
+      <w:r>
+        <w:rPr>
+          <w:rFonts w:ascii="Times New Roman" w:eastAsia="Times New Roman" w:hAnsi="Times New Roman" w:cs="Times New Roman"/>
+          <w:kern w:val="0"/>
+          <w:lang w:eastAsia="en-US" w:bidi="ar-SA"/>
+        </w:rPr>
+        <w:t>J=\</w:t>
+      </w:r>
+      <w:proofErr w:type="spellStart"/>
+      <w:r>
+        <w:rPr>
+          <w:rFonts w:ascii="Times New Roman" w:eastAsia="Times New Roman" w:hAnsi="Times New Roman" w:cs="Times New Roman"/>
+          <w:kern w:val="0"/>
+          <w:lang w:eastAsia="en-US" w:bidi="ar-SA"/>
+        </w:rPr>
+        <w:t>intop</w:t>
+      </w:r>
+      <w:proofErr w:type="spellEnd"/>
+      <w:r>
+        <w:rPr>
+          <w:rFonts w:ascii="Times New Roman" w:eastAsia="Times New Roman" w:hAnsi="Times New Roman" w:cs="Times New Roman"/>
+          <w:kern w:val="0"/>
+          <w:lang w:eastAsia="en-US" w:bidi="ar-SA"/>
+        </w:rPr>
+        <w:t>_{</w:t>
+      </w:r>
+      <w:proofErr w:type="gramStart"/>
+      <w:r>
+        <w:rPr>
+          <w:rFonts w:ascii="Times New Roman" w:eastAsia="Times New Roman" w:hAnsi="Times New Roman" w:cs="Times New Roman"/>
+          <w:kern w:val="0"/>
+          <w:lang w:eastAsia="en-US" w:bidi="ar-SA"/>
+        </w:rPr>
+        <w:t>0}^</w:t>
+      </w:r>
+      <w:proofErr w:type="gramEnd"/>
+      <w:r>
+        <w:rPr>
+          <w:rFonts w:ascii="Times New Roman" w:eastAsia="Times New Roman" w:hAnsi="Times New Roman" w:cs="Times New Roman"/>
+          <w:kern w:val="0"/>
+          <w:lang w:eastAsia="en-US" w:bidi="ar-SA"/>
+        </w:rPr>
+        <w:t>{t_{f</w:t>
+      </w:r>
+      <w:proofErr w:type="gramStart"/>
+      <w:r>
+        <w:rPr>
+          <w:rFonts w:ascii="Times New Roman" w:eastAsia="Times New Roman" w:hAnsi="Times New Roman" w:cs="Times New Roman"/>
+          <w:kern w:val="0"/>
+          <w:lang w:eastAsia="en-US" w:bidi="ar-SA"/>
+        </w:rPr>
+        <w:t>}}\</w:t>
+      </w:r>
+      <w:proofErr w:type="gramEnd"/>
+      <w:r>
+        <w:rPr>
+          <w:rFonts w:ascii="Times New Roman" w:eastAsia="Times New Roman" w:hAnsi="Times New Roman" w:cs="Times New Roman"/>
+          <w:kern w:val="0"/>
+          <w:lang w:eastAsia="en-US" w:bidi="ar-SA"/>
+        </w:rPr>
+        <w:t>left(q_{e}\</w:t>
+      </w:r>
+      <w:proofErr w:type="spellStart"/>
+      <w:r>
+        <w:rPr>
+          <w:rFonts w:ascii="Times New Roman" w:eastAsia="Times New Roman" w:hAnsi="Times New Roman" w:cs="Times New Roman"/>
+          <w:kern w:val="0"/>
+          <w:lang w:eastAsia="en-US" w:bidi="ar-SA"/>
+        </w:rPr>
+        <w:t>cdot</w:t>
+      </w:r>
+      <w:proofErr w:type="spellEnd"/>
+      <w:r>
+        <w:rPr>
+          <w:rFonts w:ascii="Times New Roman" w:eastAsia="Times New Roman" w:hAnsi="Times New Roman" w:cs="Times New Roman"/>
+          <w:kern w:val="0"/>
+          <w:lang w:eastAsia="en-US" w:bidi="ar-SA"/>
+        </w:rPr>
+        <w:t xml:space="preserve"> t\left\Vert e\left(t\</w:t>
+      </w:r>
+      <w:proofErr w:type="gramStart"/>
+      <w:r>
+        <w:rPr>
+          <w:rFonts w:ascii="Times New Roman" w:eastAsia="Times New Roman" w:hAnsi="Times New Roman" w:cs="Times New Roman"/>
+          <w:kern w:val="0"/>
+          <w:lang w:eastAsia="en-US" w:bidi="ar-SA"/>
+        </w:rPr>
+        <w:t>right)\right\Vert</w:t>
+      </w:r>
+      <w:proofErr w:type="gramEnd"/>
+      <w:r>
+        <w:rPr>
+          <w:rFonts w:ascii="Times New Roman" w:eastAsia="Times New Roman" w:hAnsi="Times New Roman" w:cs="Times New Roman"/>
+          <w:kern w:val="0"/>
+          <w:lang w:eastAsia="en-US" w:bidi="ar-SA"/>
+        </w:rPr>
+        <w:t xml:space="preserve"> ^{</w:t>
+      </w:r>
+      <w:proofErr w:type="gramStart"/>
+      <w:r>
+        <w:rPr>
+          <w:rFonts w:ascii="Times New Roman" w:eastAsia="Times New Roman" w:hAnsi="Times New Roman" w:cs="Times New Roman"/>
+          <w:kern w:val="0"/>
+          <w:lang w:eastAsia="en-US" w:bidi="ar-SA"/>
+        </w:rPr>
+        <w:t>2}+</w:t>
+      </w:r>
+      <w:proofErr w:type="gramEnd"/>
+      <w:r>
+        <w:rPr>
+          <w:rFonts w:ascii="Times New Roman" w:eastAsia="Times New Roman" w:hAnsi="Times New Roman" w:cs="Times New Roman"/>
+          <w:kern w:val="0"/>
+          <w:lang w:eastAsia="en-US" w:bidi="ar-SA"/>
+        </w:rPr>
+        <w:t>r_{u}\left\Vert u\left(t\</w:t>
+      </w:r>
+      <w:proofErr w:type="gramStart"/>
+      <w:r>
+        <w:rPr>
+          <w:rFonts w:ascii="Times New Roman" w:eastAsia="Times New Roman" w:hAnsi="Times New Roman" w:cs="Times New Roman"/>
+          <w:kern w:val="0"/>
+          <w:lang w:eastAsia="en-US" w:bidi="ar-SA"/>
+        </w:rPr>
+        <w:t>right)\right\Vert</w:t>
+      </w:r>
+      <w:proofErr w:type="gramEnd"/>
+      <w:r>
+        <w:rPr>
+          <w:rFonts w:ascii="Times New Roman" w:eastAsia="Times New Roman" w:hAnsi="Times New Roman" w:cs="Times New Roman"/>
+          <w:kern w:val="0"/>
+          <w:lang w:eastAsia="en-US" w:bidi="ar-SA"/>
+        </w:rPr>
+        <w:t xml:space="preserve"> ^{</w:t>
+      </w:r>
+      <w:proofErr w:type="gramStart"/>
+      <w:r>
+        <w:rPr>
+          <w:rFonts w:ascii="Times New Roman" w:eastAsia="Times New Roman" w:hAnsi="Times New Roman" w:cs="Times New Roman"/>
+          <w:kern w:val="0"/>
+          <w:lang w:eastAsia="en-US" w:bidi="ar-SA"/>
+        </w:rPr>
+        <w:t>2}\right)dt</w:t>
+      </w:r>
+      <w:proofErr w:type="gramEnd"/>
+      <w:r>
+        <w:rPr>
+          <w:rFonts w:ascii="Times New Roman" w:eastAsia="Times New Roman" w:hAnsi="Times New Roman" w:cs="Times New Roman"/>
+          <w:kern w:val="0"/>
+          <w:lang w:eastAsia="en-US" w:bidi="ar-SA"/>
+        </w:rPr>
+        <w:t>+W_{\text{fail</w:t>
+      </w:r>
+      <w:proofErr w:type="gramStart"/>
+      <w:r>
+        <w:rPr>
+          <w:rFonts w:ascii="Times New Roman" w:eastAsia="Times New Roman" w:hAnsi="Times New Roman" w:cs="Times New Roman"/>
+          <w:kern w:val="0"/>
+          <w:lang w:eastAsia="en-US" w:bidi="ar-SA"/>
+        </w:rPr>
+        <w:t>}}\</w:t>
+      </w:r>
+      <w:proofErr w:type="gramEnd"/>
+      <w:r>
+        <w:rPr>
+          <w:rFonts w:ascii="Times New Roman" w:eastAsia="Times New Roman" w:hAnsi="Times New Roman" w:cs="Times New Roman"/>
+          <w:kern w:val="0"/>
+          <w:lang w:eastAsia="en-US" w:bidi="ar-SA"/>
+        </w:rPr>
+        <w:t>left(t_{\text{fail}}-t\</w:t>
+      </w:r>
+      <w:proofErr w:type="gramStart"/>
+      <w:r>
+        <w:rPr>
+          <w:rFonts w:ascii="Times New Roman" w:eastAsia="Times New Roman" w:hAnsi="Times New Roman" w:cs="Times New Roman"/>
+          <w:kern w:val="0"/>
+          <w:lang w:eastAsia="en-US" w:bidi="ar-SA"/>
+        </w:rPr>
+        <w:t>right)^</w:t>
+      </w:r>
+      <w:proofErr w:type="gramEnd"/>
+      <w:r>
+        <w:rPr>
+          <w:rFonts w:ascii="Times New Roman" w:eastAsia="Times New Roman" w:hAnsi="Times New Roman" w:cs="Times New Roman"/>
+          <w:kern w:val="0"/>
+          <w:lang w:eastAsia="en-US" w:bidi="ar-SA"/>
+        </w:rPr>
+        <w:t>{2</w:t>
+      </w:r>
+      <w:proofErr w:type="gramStart"/>
+      <w:r>
+        <w:rPr>
+          <w:rFonts w:ascii="Times New Roman" w:eastAsia="Times New Roman" w:hAnsi="Times New Roman" w:cs="Times New Roman"/>
+          <w:kern w:val="0"/>
+          <w:lang w:eastAsia="en-US" w:bidi="ar-SA"/>
+        </w:rPr>
+        <w:t>},where</w:t>
+      </w:r>
+      <w:proofErr w:type="gramEnd"/>
+      <w:r>
+        <w:rPr>
+          <w:rFonts w:ascii="Times New Roman" w:eastAsia="Times New Roman" w:hAnsi="Times New Roman" w:cs="Times New Roman"/>
+          <w:kern w:val="0"/>
+          <w:lang w:eastAsia="en-US" w:bidi="ar-SA"/>
+        </w:rPr>
+        <w:t xml:space="preserve"> r_{u}=0.2, q_{e}=1, W_{\text{fail</w:t>
+      </w:r>
+      <w:proofErr w:type="gramStart"/>
+      <w:r>
+        <w:rPr>
+          <w:rFonts w:ascii="Times New Roman" w:eastAsia="Times New Roman" w:hAnsi="Times New Roman" w:cs="Times New Roman"/>
+          <w:kern w:val="0"/>
+          <w:lang w:eastAsia="en-US" w:bidi="ar-SA"/>
+        </w:rPr>
+        <w:t>}}=</w:t>
+      </w:r>
+      <w:proofErr w:type="gramEnd"/>
+      <w:r>
+        <w:rPr>
+          <w:rFonts w:ascii="Times New Roman" w:eastAsia="Times New Roman" w:hAnsi="Times New Roman" w:cs="Times New Roman"/>
+          <w:kern w:val="0"/>
+          <w:lang w:eastAsia="en-US" w:bidi="ar-SA"/>
+        </w:rPr>
+        <w:t>1000, t_{f}\in\</w:t>
+      </w:r>
+      <w:proofErr w:type="spellStart"/>
+      <w:r>
+        <w:rPr>
+          <w:rFonts w:ascii="Times New Roman" w:eastAsia="Times New Roman" w:hAnsi="Times New Roman" w:cs="Times New Roman"/>
+          <w:kern w:val="0"/>
+          <w:lang w:eastAsia="en-US" w:bidi="ar-SA"/>
+        </w:rPr>
+        <w:t>mathbb</w:t>
+      </w:r>
+      <w:proofErr w:type="spellEnd"/>
+      <w:r>
+        <w:rPr>
+          <w:rFonts w:ascii="Times New Roman" w:eastAsia="Times New Roman" w:hAnsi="Times New Roman" w:cs="Times New Roman"/>
+          <w:kern w:val="0"/>
+          <w:lang w:eastAsia="en-US" w:bidi="ar-SA"/>
+        </w:rPr>
+        <w:t>{R}_{&gt;t</w:t>
+      </w:r>
+      <w:proofErr w:type="gramStart"/>
+      <w:r>
+        <w:rPr>
+          <w:rFonts w:ascii="Times New Roman" w:eastAsia="Times New Roman" w:hAnsi="Times New Roman" w:cs="Times New Roman"/>
+          <w:kern w:val="0"/>
+          <w:lang w:eastAsia="en-US" w:bidi="ar-SA"/>
+        </w:rPr>
+        <w:t>_{</w:t>
+      </w:r>
+      <w:proofErr w:type="gramEnd"/>
+      <w:r>
+        <w:rPr>
+          <w:rFonts w:ascii="Times New Roman" w:eastAsia="Times New Roman" w:hAnsi="Times New Roman" w:cs="Times New Roman"/>
+          <w:kern w:val="0"/>
+          <w:lang w:eastAsia="en-US" w:bidi="ar-SA"/>
+        </w:rPr>
+        <w:t>0}} is the total simulation duration, and t_{\text{fail</w:t>
+      </w:r>
+      <w:proofErr w:type="gramStart"/>
+      <w:r>
+        <w:rPr>
+          <w:rFonts w:ascii="Times New Roman" w:eastAsia="Times New Roman" w:hAnsi="Times New Roman" w:cs="Times New Roman"/>
+          <w:kern w:val="0"/>
+          <w:lang w:eastAsia="en-US" w:bidi="ar-SA"/>
+        </w:rPr>
+        <w:t>}}\in\left</w:t>
+      </w:r>
+      <w:proofErr w:type="gramEnd"/>
+      <w:r>
+        <w:rPr>
+          <w:rFonts w:ascii="Times New Roman" w:eastAsia="Times New Roman" w:hAnsi="Times New Roman" w:cs="Times New Roman"/>
+          <w:kern w:val="0"/>
+          <w:lang w:eastAsia="en-US" w:bidi="ar-SA"/>
+        </w:rPr>
+        <w:t>(t_{0</w:t>
+      </w:r>
+      <w:proofErr w:type="gramStart"/>
+      <w:r>
+        <w:rPr>
+          <w:rFonts w:ascii="Times New Roman" w:eastAsia="Times New Roman" w:hAnsi="Times New Roman" w:cs="Times New Roman"/>
+          <w:kern w:val="0"/>
+          <w:lang w:eastAsia="en-US" w:bidi="ar-SA"/>
+        </w:rPr>
+        <w:t>},t</w:t>
+      </w:r>
+      <w:proofErr w:type="gramEnd"/>
+      <w:r>
+        <w:rPr>
+          <w:rFonts w:ascii="Times New Roman" w:eastAsia="Times New Roman" w:hAnsi="Times New Roman" w:cs="Times New Roman"/>
+          <w:kern w:val="0"/>
+          <w:lang w:eastAsia="en-US" w:bidi="ar-SA"/>
+        </w:rPr>
+        <w:t>_{f}\right] is time at which the drone escapes the simulated space (t_{f}=t_{\text{fail}} if it does not escape). The integral was evaluated using the trapezoidal rule.</w:t>
+      </w:r>
     </w:p>
     <w:p>
       <w:pPr>
@@ -742,10 +389,7 @@
         <w:pStyle w:val="Standard"/>
       </w:pPr>
       <w:r>
-        <w:t xml:space="preserve">There are two desired trajectories. </w:t>
-      </w:r>
-      <w:r>
-        <w:t>A warped figure eight (trajectory 1) and a 4-petal rose. Below is data for trajectory 1 only. No wind. It finished in 80. 250 trials max with 50 patience (patience means it exits if no improvement in that many trials).</w:t>
+        <w:t>There are two desired trajectories. A warped figure eight (trajectory 1) and a 4-petal rose. Below is data for trajectory 1 only. No wind. It finished in 80. 250 trials max with 50 patience (patience means it exits if no improvement in that many trials).</w:t>
       </w:r>
       <w:r>
         <w:t xml:space="preserve"> I found these searches by iterating many times with the </w:t>
@@ -2209,33 +1853,33 @@
         <w:rPr>
           <w:lang w:bidi="ar-SA"/>
         </w:rPr>
+        <w:t xml:space="preserve">6      | 23      | 29.5      | 1.03    | 0.1     | 0.63    | 0.0299   </w:t>
+      </w:r>
+    </w:p>
+    <w:p>
+      <w:pPr>
+        <w:rPr>
+          <w:lang w:bidi="ar-SA"/>
+        </w:rPr>
+      </w:pPr>
+      <w:r>
+        <w:rPr>
+          <w:lang w:bidi="ar-SA"/>
+        </w:rPr>
+        <w:t xml:space="preserve">7      | 31      | 30.3      | 1.38    | 0.121   | 0.466   | 0.0145   </w:t>
+      </w:r>
+    </w:p>
+    <w:p>
+      <w:pPr>
+        <w:rPr>
+          <w:lang w:bidi="ar-SA"/>
+        </w:rPr>
+      </w:pPr>
+      <w:r>
+        <w:rPr>
+          <w:lang w:bidi="ar-SA"/>
+        </w:rPr>
         <w:lastRenderedPageBreak/>
-        <w:t xml:space="preserve">6      | 23      | 29.5      | 1.03    | 0.1     | 0.63    | 0.0299   </w:t>
-      </w:r>
-    </w:p>
-    <w:p>
-      <w:pPr>
-        <w:rPr>
-          <w:lang w:bidi="ar-SA"/>
-        </w:rPr>
-      </w:pPr>
-      <w:r>
-        <w:rPr>
-          <w:lang w:bidi="ar-SA"/>
-        </w:rPr>
-        <w:t xml:space="preserve">7      | 31      | 30.3      | 1.38    | 0.121   | 0.466   | 0.0145   </w:t>
-      </w:r>
-    </w:p>
-    <w:p>
-      <w:pPr>
-        <w:rPr>
-          <w:lang w:bidi="ar-SA"/>
-        </w:rPr>
-      </w:pPr>
-      <w:r>
-        <w:rPr>
-          <w:lang w:bidi="ar-SA"/>
-        </w:rPr>
         <w:t xml:space="preserve">8      | 77      | 31.4      | 1.45    | 0.246   | 0.757   | 0.0451   </w:t>
       </w:r>
     </w:p>
@@ -2403,10 +2047,7 @@
         <w:pStyle w:val="Standard"/>
       </w:pPr>
       <w:r>
-        <w:t xml:space="preserve">PHASE </w:t>
-      </w:r>
-      <w:r>
-        <w:t>2</w:t>
+        <w:t>PHASE 2</w:t>
       </w:r>
     </w:p>
     <w:p>
@@ -3950,7 +3591,425 @@
         <w:rPr>
           <w:rFonts w:ascii="Apple Color Emoji" w:hAnsi="Apple Color Emoji" w:cs="Apple Color Emoji"/>
         </w:rPr>
+        <w:t>🏆</w:t>
+      </w:r>
+      <w:r>
+        <w:t xml:space="preserve"> ABSOLUTE BEST TRIAL </w:t>
+      </w:r>
+      <w:r>
+        <w:rPr>
+          <w:rFonts w:ascii="Apple Color Emoji" w:hAnsi="Apple Color Emoji" w:cs="Apple Color Emoji"/>
+        </w:rPr>
+        <w:t>🏆</w:t>
+      </w:r>
+    </w:p>
+    <w:p>
+      <w:pPr>
+        <w:pStyle w:val="Standard"/>
+      </w:pPr>
+      <w:r>
+        <w:t>========================================</w:t>
+      </w:r>
+    </w:p>
+    <w:p>
+      <w:pPr>
+        <w:pStyle w:val="Standard"/>
+      </w:pPr>
+      <w:r>
         <w:lastRenderedPageBreak/>
+        <w:t xml:space="preserve">Trial </w:t>
+      </w:r>
+      <w:proofErr w:type="gramStart"/>
+      <w:r>
+        <w:t>Number :</w:t>
+      </w:r>
+      <w:proofErr w:type="gramEnd"/>
+      <w:r>
+        <w:t xml:space="preserve"> 208</w:t>
+      </w:r>
+    </w:p>
+    <w:p>
+      <w:pPr>
+        <w:pStyle w:val="Standard"/>
+      </w:pPr>
+      <w:r>
+        <w:t xml:space="preserve">ITAE Cost  </w:t>
+      </w:r>
+      <w:proofErr w:type="gramStart"/>
+      <w:r>
+        <w:t xml:space="preserve">  :</w:t>
+      </w:r>
+      <w:proofErr w:type="gramEnd"/>
+      <w:r>
+        <w:t xml:space="preserve"> 47.5804</w:t>
+      </w:r>
+    </w:p>
+    <w:p>
+      <w:pPr>
+        <w:pStyle w:val="Standard"/>
+      </w:pPr>
+      <w:r>
+        <w:t xml:space="preserve">Parameters </w:t>
+      </w:r>
+      <w:proofErr w:type="gramStart"/>
+      <w:r>
+        <w:t xml:space="preserve">  :</w:t>
+      </w:r>
+      <w:proofErr w:type="gramEnd"/>
+    </w:p>
+    <w:p>
+      <w:pPr>
+        <w:pStyle w:val="Standard"/>
+      </w:pPr>
+      <w:r>
+        <w:t xml:space="preserve">    </w:t>
+      </w:r>
+      <w:proofErr w:type="spellStart"/>
+      <w:r>
+        <w:t>initial_weight_scale_factor</w:t>
+      </w:r>
+      <w:proofErr w:type="spellEnd"/>
+      <w:r>
+        <w:t>: 0.2</w:t>
+      </w:r>
+    </w:p>
+    <w:p>
+      <w:pPr>
+        <w:pStyle w:val="Standard"/>
+      </w:pPr>
+      <w:r>
+        <w:t xml:space="preserve">    </w:t>
+      </w:r>
+      <w:proofErr w:type="spellStart"/>
+      <w:r>
+        <w:t>num_blocks</w:t>
+      </w:r>
+      <w:proofErr w:type="spellEnd"/>
+      <w:r>
+        <w:t>: 4</w:t>
+      </w:r>
+    </w:p>
+    <w:p>
+      <w:pPr>
+        <w:pStyle w:val="Standard"/>
+      </w:pPr>
+      <w:r>
+        <w:t xml:space="preserve">    k_0: 2</w:t>
+      </w:r>
+    </w:p>
+    <w:p>
+      <w:pPr>
+        <w:pStyle w:val="Standard"/>
+      </w:pPr>
+      <w:r>
+        <w:t xml:space="preserve">    </w:t>
+      </w:r>
+      <w:proofErr w:type="spellStart"/>
+      <w:r>
+        <w:t>k_i</w:t>
+      </w:r>
+      <w:proofErr w:type="spellEnd"/>
+      <w:r>
+        <w:t>: 4</w:t>
+      </w:r>
+    </w:p>
+    <w:p>
+      <w:pPr>
+        <w:pStyle w:val="Standard"/>
+      </w:pPr>
+      <w:r>
+        <w:t xml:space="preserve">    </w:t>
+      </w:r>
+      <w:proofErr w:type="spellStart"/>
+      <w:r>
+        <w:t>hidden_width</w:t>
+      </w:r>
+      <w:proofErr w:type="spellEnd"/>
+      <w:r>
+        <w:t>: 8</w:t>
+      </w:r>
+    </w:p>
+    <w:p>
+      <w:pPr>
+        <w:pStyle w:val="Standard"/>
+      </w:pPr>
+      <w:r>
+        <w:t xml:space="preserve">    gamma: 6.7362992973814935</w:t>
+      </w:r>
+    </w:p>
+    <w:p>
+      <w:pPr>
+        <w:pStyle w:val="Standard"/>
+      </w:pPr>
+      <w:r>
+        <w:t xml:space="preserve">    </w:t>
+      </w:r>
+      <w:proofErr w:type="spellStart"/>
+      <w:r>
+        <w:t>sigma_mod</w:t>
+      </w:r>
+      <w:proofErr w:type="spellEnd"/>
+      <w:r>
+        <w:t>: 1.0312702653999692</w:t>
+      </w:r>
+    </w:p>
+    <w:p>
+      <w:pPr>
+        <w:pStyle w:val="Standard"/>
+      </w:pPr>
+    </w:p>
+    <w:p>
+      <w:pPr>
+        <w:pStyle w:val="Standard"/>
+      </w:pPr>
+    </w:p>
+    <w:p>
+      <w:pPr>
+        <w:pStyle w:val="Standard"/>
+      </w:pPr>
+      <w:r>
+        <w:t>BASELINE</w:t>
+      </w:r>
+    </w:p>
+    <w:p>
+      <w:pPr>
+        <w:pStyle w:val="Standard"/>
+      </w:pPr>
+      <w:r>
+        <w:t>===============================================================================================</w:t>
+      </w:r>
+    </w:p>
+    <w:p>
+      <w:pPr>
+        <w:pStyle w:val="Standard"/>
+      </w:pPr>
+      <w:r>
+        <w:t xml:space="preserve">Rank   | Trial   | Cost      | </w:t>
+      </w:r>
+      <w:proofErr w:type="spellStart"/>
+      <w:r>
+        <w:t>num_blocks</w:t>
+      </w:r>
+      <w:proofErr w:type="spellEnd"/>
+      <w:r>
+        <w:t xml:space="preserve"> | </w:t>
+      </w:r>
+      <w:proofErr w:type="spellStart"/>
+      <w:r>
+        <w:t>hidden_width</w:t>
+      </w:r>
+      <w:proofErr w:type="spellEnd"/>
+      <w:r>
+        <w:t xml:space="preserve"> | k_0    | </w:t>
+      </w:r>
+      <w:proofErr w:type="spellStart"/>
+      <w:r>
+        <w:t>k_i</w:t>
+      </w:r>
+      <w:proofErr w:type="spellEnd"/>
+      <w:r>
+        <w:t xml:space="preserve">    | gamma   | </w:t>
+      </w:r>
+      <w:proofErr w:type="spellStart"/>
+      <w:r>
+        <w:t>sigma_mod</w:t>
+      </w:r>
+      <w:proofErr w:type="spellEnd"/>
+      <w:r>
+        <w:t xml:space="preserve"> | W_s   </w:t>
+      </w:r>
+    </w:p>
+    <w:p>
+      <w:pPr>
+        <w:pStyle w:val="Standard"/>
+      </w:pPr>
+      <w:r>
+        <w:t>---------------------------------------------------------------------------------------------------------</w:t>
+      </w:r>
+    </w:p>
+    <w:p>
+      <w:pPr>
+        <w:pStyle w:val="Standard"/>
+      </w:pPr>
+      <w:r>
+        <w:t xml:space="preserve">1      | 208     | 47.6      | 4          | 8            | 2      | 4      | 6.74    | 1.03      | 0.2   </w:t>
+      </w:r>
+    </w:p>
+    <w:p>
+      <w:pPr>
+        <w:pStyle w:val="Standard"/>
+      </w:pPr>
+      <w:r>
+        <w:t xml:space="preserve">2      | 213     | 47.9      | 4          | 8            | 2      | 4      | 8.85    | 0.995     | 0.2   </w:t>
+      </w:r>
+    </w:p>
+    <w:p>
+      <w:pPr>
+        <w:pStyle w:val="Standard"/>
+      </w:pPr>
+      <w:r>
+        <w:t xml:space="preserve">3      | 373     | 47.9      | 4          | 8            | 2      | 4      | 6.66    | 1.07      | 0.2   </w:t>
+      </w:r>
+    </w:p>
+    <w:p>
+      <w:pPr>
+        <w:pStyle w:val="Standard"/>
+      </w:pPr>
+      <w:r>
+        <w:t xml:space="preserve">4      | 246     | 48.1      | 4          | 8            | 2      | 4      | 6.86    | 1.14      | 0.2   </w:t>
+      </w:r>
+    </w:p>
+    <w:p>
+      <w:pPr>
+        <w:pStyle w:val="Standard"/>
+      </w:pPr>
+      <w:r>
+        <w:t xml:space="preserve">5      | 365     | 48.1      | 4          | 8            | 2      | 4      | 5.27    | 1.05      | 0.2   </w:t>
+      </w:r>
+    </w:p>
+    <w:p>
+      <w:pPr>
+        <w:pStyle w:val="Standard"/>
+      </w:pPr>
+      <w:r>
+        <w:t xml:space="preserve">6      | 293     | 48.1      | 4          | 8            | 2      | 4      | 8.02    | 1.13      | 0.2   </w:t>
+      </w:r>
+    </w:p>
+    <w:p>
+      <w:pPr>
+        <w:pStyle w:val="Standard"/>
+      </w:pPr>
+      <w:r>
+        <w:t xml:space="preserve">7      | 250     | 48.1      | 4          | 8            | 2      | 4      | 7.54    | 1.06      | 0.2   </w:t>
+      </w:r>
+    </w:p>
+    <w:p>
+      <w:pPr>
+        <w:pStyle w:val="Standard"/>
+      </w:pPr>
+      <w:r>
+        <w:t xml:space="preserve">8      | 189     | 48.2      | 4          | 8            | 2      | 4      | 4.6     | 1.08      | 0.2   </w:t>
+      </w:r>
+    </w:p>
+    <w:p>
+      <w:pPr>
+        <w:pStyle w:val="Standard"/>
+      </w:pPr>
+      <w:r>
+        <w:t xml:space="preserve">9      | 323     | 48.2      | 4          | 8            | 2      | 4      | 8.08    | 1.03      | 0.2   </w:t>
+      </w:r>
+    </w:p>
+    <w:p>
+      <w:pPr>
+        <w:pStyle w:val="Standard"/>
+      </w:pPr>
+      <w:r>
+        <w:t xml:space="preserve">10     | 385     | 48.2      | 4          | 8            | 2      | 4      | 7.4     | 1.01      | 0.2   </w:t>
+      </w:r>
+    </w:p>
+    <w:p>
+      <w:pPr>
+        <w:pStyle w:val="Standard"/>
+      </w:pPr>
+      <w:r>
+        <w:t xml:space="preserve">11     | 396     | 48.2      | 4          | 8            | 2      | 4      | 6.43    | 1.04      | 0.2   </w:t>
+      </w:r>
+    </w:p>
+    <w:p>
+      <w:pPr>
+        <w:pStyle w:val="Standard"/>
+      </w:pPr>
+      <w:r>
+        <w:t xml:space="preserve">12     | 245     | 48.3      | 4          | 8            | 2      | 4      | 7.45    | 1.04      | 0.2   </w:t>
+      </w:r>
+    </w:p>
+    <w:p>
+      <w:pPr>
+        <w:pStyle w:val="Standard"/>
+      </w:pPr>
+      <w:r>
+        <w:t xml:space="preserve">13     | 188     | 48.3      | 4          | 8            | 2      | 4      | 4.36    | 1.1       | 0.2   </w:t>
+      </w:r>
+    </w:p>
+    <w:p>
+      <w:pPr>
+        <w:pStyle w:val="Standard"/>
+      </w:pPr>
+      <w:r>
+        <w:t xml:space="preserve">14     | 366     | 48.3      | 4          | 8            | 2      | 4      | 7.41    | 1.05      | 0.2   </w:t>
+      </w:r>
+    </w:p>
+    <w:p>
+      <w:pPr>
+        <w:pStyle w:val="Standard"/>
+      </w:pPr>
+      <w:r>
+        <w:t xml:space="preserve">15     | 219     | 48.4      | 4          | 8            | 2      | 4      | 6.99    | 1.04      | 0.2   </w:t>
+      </w:r>
+    </w:p>
+    <w:p>
+      <w:pPr>
+        <w:pStyle w:val="Standard"/>
+      </w:pPr>
+      <w:r>
+        <w:t>=========================================================================================================</w:t>
+      </w:r>
+    </w:p>
+    <w:p>
+      <w:pPr>
+        <w:pStyle w:val="Standard"/>
+      </w:pPr>
+    </w:p>
+    <w:p>
+      <w:pPr>
+        <w:pStyle w:val="Standard"/>
+      </w:pPr>
+      <w:proofErr w:type="spellStart"/>
+      <w:r>
+        <w:t>max@Maxs-MacBook-Pro</w:t>
+      </w:r>
+      <w:proofErr w:type="spellEnd"/>
+      <w:r>
+        <w:t xml:space="preserve"> voxl-px4-sitl % python3 get_best_results.py developed</w:t>
+      </w:r>
+    </w:p>
+    <w:p>
+      <w:pPr>
+        <w:pStyle w:val="Standard"/>
+      </w:pPr>
+      <w:r>
+        <w:t xml:space="preserve">[*] Loading developed study 'phase2_developed_wind_optimization' from </w:t>
+      </w:r>
+      <w:proofErr w:type="spellStart"/>
+      <w:r>
+        <w:t>sqlite</w:t>
+      </w:r>
+      <w:proofErr w:type="spellEnd"/>
+      <w:r>
+        <w:t>:///phase2_developed_wind.db...</w:t>
+      </w:r>
+    </w:p>
+    <w:p>
+      <w:pPr>
+        <w:pStyle w:val="Standard"/>
+      </w:pPr>
+    </w:p>
+    <w:p>
+      <w:pPr>
+        <w:pStyle w:val="Standard"/>
+      </w:pPr>
+      <w:r>
+        <w:t>========================================</w:t>
+      </w:r>
+    </w:p>
+    <w:p>
+      <w:pPr>
+        <w:pStyle w:val="Standard"/>
+      </w:pPr>
+      <w:r>
+        <w:rPr>
+          <w:rFonts w:ascii="Apple Color Emoji" w:hAnsi="Apple Color Emoji" w:cs="Apple Color Emoji"/>
+        </w:rPr>
         <w:t>🏆</w:t>
       </w:r>
       <w:r>
@@ -3984,7 +4043,7 @@
       </w:r>
       <w:proofErr w:type="gramEnd"/>
       <w:r>
-        <w:t xml:space="preserve"> 208</w:t>
+        <w:t xml:space="preserve"> 154</w:t>
       </w:r>
     </w:p>
     <w:p>
@@ -4000,7 +4059,7 @@
       </w:r>
       <w:proofErr w:type="gramEnd"/>
       <w:r>
-        <w:t xml:space="preserve"> 47.5804</w:t>
+        <w:t xml:space="preserve"> 48.7975</w:t>
       </w:r>
     </w:p>
     <w:p>
@@ -4037,6 +4096,7 @@
         <w:pStyle w:val="Standard"/>
       </w:pPr>
       <w:r>
+        <w:lastRenderedPageBreak/>
         <w:t xml:space="preserve">    </w:t>
       </w:r>
       <w:proofErr w:type="spellStart"/>
@@ -4053,434 +4113,7 @@
         <w:pStyle w:val="Standard"/>
       </w:pPr>
       <w:r>
-        <w:t xml:space="preserve">    k_0: 2</w:t>
-      </w:r>
-    </w:p>
-    <w:p>
-      <w:pPr>
-        <w:pStyle w:val="Standard"/>
-      </w:pPr>
-      <w:r>
-        <w:t xml:space="preserve">    </w:t>
-      </w:r>
-      <w:proofErr w:type="spellStart"/>
-      <w:r>
-        <w:t>k_i</w:t>
-      </w:r>
-      <w:proofErr w:type="spellEnd"/>
-      <w:r>
-        <w:t>: 4</w:t>
-      </w:r>
-    </w:p>
-    <w:p>
-      <w:pPr>
-        <w:pStyle w:val="Standard"/>
-      </w:pPr>
-      <w:r>
-        <w:t xml:space="preserve">    </w:t>
-      </w:r>
-      <w:proofErr w:type="spellStart"/>
-      <w:r>
-        <w:t>hidden_width</w:t>
-      </w:r>
-      <w:proofErr w:type="spellEnd"/>
-      <w:r>
-        <w:t>: 8</w:t>
-      </w:r>
-    </w:p>
-    <w:p>
-      <w:pPr>
-        <w:pStyle w:val="Standard"/>
-      </w:pPr>
-      <w:r>
-        <w:t xml:space="preserve">    gamma: 6.7362992973814935</w:t>
-      </w:r>
-    </w:p>
-    <w:p>
-      <w:pPr>
-        <w:pStyle w:val="Standard"/>
-      </w:pPr>
-      <w:r>
-        <w:t xml:space="preserve">    </w:t>
-      </w:r>
-      <w:proofErr w:type="spellStart"/>
-      <w:r>
-        <w:t>sigma_mod</w:t>
-      </w:r>
-      <w:proofErr w:type="spellEnd"/>
-      <w:r>
-        <w:t>: 1.0312702653999692</w:t>
-      </w:r>
-    </w:p>
-    <w:p>
-      <w:pPr>
-        <w:pStyle w:val="Standard"/>
-      </w:pPr>
-    </w:p>
-    <w:p>
-      <w:pPr>
-        <w:pStyle w:val="Standard"/>
-      </w:pPr>
-    </w:p>
-    <w:p>
-      <w:pPr>
-        <w:pStyle w:val="Standard"/>
-      </w:pPr>
-      <w:r>
-        <w:t>BASELINE</w:t>
-      </w:r>
-    </w:p>
-    <w:p>
-      <w:pPr>
-        <w:pStyle w:val="Standard"/>
-      </w:pPr>
-      <w:r>
-        <w:t>===============================================================================================</w:t>
-      </w:r>
-    </w:p>
-    <w:p>
-      <w:pPr>
-        <w:pStyle w:val="Standard"/>
-      </w:pPr>
-      <w:r>
-        <w:t xml:space="preserve">Rank   | Trial   | Cost      | </w:t>
-      </w:r>
-      <w:proofErr w:type="spellStart"/>
-      <w:r>
-        <w:t>num_blocks</w:t>
-      </w:r>
-      <w:proofErr w:type="spellEnd"/>
-      <w:r>
-        <w:t xml:space="preserve"> | </w:t>
-      </w:r>
-      <w:proofErr w:type="spellStart"/>
-      <w:r>
-        <w:t>hidden_width</w:t>
-      </w:r>
-      <w:proofErr w:type="spellEnd"/>
-      <w:r>
-        <w:t xml:space="preserve"> | k_0    | </w:t>
-      </w:r>
-      <w:proofErr w:type="spellStart"/>
-      <w:r>
-        <w:t>k_i</w:t>
-      </w:r>
-      <w:proofErr w:type="spellEnd"/>
-      <w:r>
-        <w:t xml:space="preserve">    | gamma   | </w:t>
-      </w:r>
-      <w:proofErr w:type="spellStart"/>
-      <w:r>
-        <w:t>sigma_mod</w:t>
-      </w:r>
-      <w:proofErr w:type="spellEnd"/>
-      <w:r>
-        <w:t xml:space="preserve"> | W_s   </w:t>
-      </w:r>
-    </w:p>
-    <w:p>
-      <w:pPr>
-        <w:pStyle w:val="Standard"/>
-      </w:pPr>
-      <w:r>
-        <w:t>---------------------------------------------------------------------------------------------------------</w:t>
-      </w:r>
-    </w:p>
-    <w:p>
-      <w:pPr>
-        <w:pStyle w:val="Standard"/>
-      </w:pPr>
-      <w:r>
-        <w:t xml:space="preserve">1      | 208     | 47.6      | 4          | 8            | 2      | 4      | 6.74    | 1.03      | 0.2   </w:t>
-      </w:r>
-    </w:p>
-    <w:p>
-      <w:pPr>
-        <w:pStyle w:val="Standard"/>
-      </w:pPr>
-      <w:r>
-        <w:t xml:space="preserve">2      | 213     | 47.9      | 4          | 8            | 2      | 4      | 8.85    | 0.995     | 0.2   </w:t>
-      </w:r>
-    </w:p>
-    <w:p>
-      <w:pPr>
-        <w:pStyle w:val="Standard"/>
-      </w:pPr>
-      <w:r>
-        <w:t xml:space="preserve">3      | 373     | 47.9      | 4          | 8            | 2      | 4      | 6.66    | 1.07      | 0.2   </w:t>
-      </w:r>
-    </w:p>
-    <w:p>
-      <w:pPr>
-        <w:pStyle w:val="Standard"/>
-      </w:pPr>
-      <w:r>
-        <w:t xml:space="preserve">4      | 246     | 48.1      | 4          | 8            | 2      | 4      | 6.86    | 1.14      | 0.2   </w:t>
-      </w:r>
-    </w:p>
-    <w:p>
-      <w:pPr>
-        <w:pStyle w:val="Standard"/>
-      </w:pPr>
-      <w:r>
-        <w:t xml:space="preserve">5      | 365     | 48.1      | 4          | 8            | 2      | 4      | 5.27    | 1.05      | 0.2   </w:t>
-      </w:r>
-    </w:p>
-    <w:p>
-      <w:pPr>
-        <w:pStyle w:val="Standard"/>
-      </w:pPr>
-      <w:r>
-        <w:t xml:space="preserve">6      | 293     | 48.1      | 4          | 8            | 2      | 4      | 8.02    | 1.13      | 0.2   </w:t>
-      </w:r>
-    </w:p>
-    <w:p>
-      <w:pPr>
-        <w:pStyle w:val="Standard"/>
-      </w:pPr>
-      <w:r>
-        <w:t xml:space="preserve">7      | 250     | 48.1      | 4          | 8            | 2      | 4      | 7.54    | 1.06      | 0.2   </w:t>
-      </w:r>
-    </w:p>
-    <w:p>
-      <w:pPr>
-        <w:pStyle w:val="Standard"/>
-      </w:pPr>
-      <w:r>
-        <w:t xml:space="preserve">8      | 189     | 48.2      | 4          | 8            | 2      | 4      | 4.6     | 1.08      | 0.2   </w:t>
-      </w:r>
-    </w:p>
-    <w:p>
-      <w:pPr>
-        <w:pStyle w:val="Standard"/>
-      </w:pPr>
-      <w:r>
-        <w:t xml:space="preserve">9      | 323     | 48.2      | 4          | 8            | 2      | 4      | 8.08    | 1.03      | 0.2   </w:t>
-      </w:r>
-    </w:p>
-    <w:p>
-      <w:pPr>
-        <w:pStyle w:val="Standard"/>
-      </w:pPr>
-      <w:r>
-        <w:t xml:space="preserve">10     | 385     | 48.2      | 4          | 8            | 2      | 4      | 7.4     | 1.01      | 0.2   </w:t>
-      </w:r>
-    </w:p>
-    <w:p>
-      <w:pPr>
-        <w:pStyle w:val="Standard"/>
-      </w:pPr>
-      <w:r>
-        <w:t xml:space="preserve">11     | 396     | 48.2      | 4          | 8            | 2      | 4      | 6.43    | 1.04      | 0.2   </w:t>
-      </w:r>
-    </w:p>
-    <w:p>
-      <w:pPr>
-        <w:pStyle w:val="Standard"/>
-      </w:pPr>
-      <w:r>
-        <w:t xml:space="preserve">12     | 245     | 48.3      | 4          | 8            | 2      | 4      | 7.45    | 1.04      | 0.2   </w:t>
-      </w:r>
-    </w:p>
-    <w:p>
-      <w:pPr>
-        <w:pStyle w:val="Standard"/>
-      </w:pPr>
-      <w:r>
-        <w:t xml:space="preserve">13     | 188     | 48.3      | 4          | 8            | 2      | 4      | 4.36    | 1.1       | 0.2   </w:t>
-      </w:r>
-    </w:p>
-    <w:p>
-      <w:pPr>
-        <w:pStyle w:val="Standard"/>
-      </w:pPr>
-      <w:r>
-        <w:t xml:space="preserve">14     | 366     | 48.3      | 4          | 8            | 2      | 4      | 7.41    | 1.05      | 0.2   </w:t>
-      </w:r>
-    </w:p>
-    <w:p>
-      <w:pPr>
-        <w:pStyle w:val="Standard"/>
-      </w:pPr>
-      <w:r>
-        <w:t xml:space="preserve">15     | 219     | 48.4      | 4          | 8            | 2      | 4      | 6.99    | 1.04      | 0.2   </w:t>
-      </w:r>
-    </w:p>
-    <w:p>
-      <w:pPr>
-        <w:pStyle w:val="Standard"/>
-      </w:pPr>
-      <w:r>
-        <w:t>=========================================================================================================</w:t>
-      </w:r>
-    </w:p>
-    <w:p>
-      <w:pPr>
-        <w:pStyle w:val="Standard"/>
-      </w:pPr>
-    </w:p>
-    <w:p>
-      <w:pPr>
-        <w:pStyle w:val="Standard"/>
-      </w:pPr>
-      <w:proofErr w:type="spellStart"/>
-      <w:r>
-        <w:t>max@Maxs-MacBook-Pro</w:t>
-      </w:r>
-      <w:proofErr w:type="spellEnd"/>
-      <w:r>
-        <w:t xml:space="preserve"> voxl-px4-sitl % python3 get_best_results.py developed</w:t>
-      </w:r>
-    </w:p>
-    <w:p>
-      <w:pPr>
-        <w:pStyle w:val="Standard"/>
-      </w:pPr>
-      <w:r>
-        <w:t xml:space="preserve">[*] Loading developed study 'phase2_developed_wind_optimization' from </w:t>
-      </w:r>
-      <w:proofErr w:type="spellStart"/>
-      <w:r>
-        <w:t>sqlite</w:t>
-      </w:r>
-      <w:proofErr w:type="spellEnd"/>
-      <w:r>
-        <w:t>:///phase2_developed_wind.db...</w:t>
-      </w:r>
-    </w:p>
-    <w:p>
-      <w:pPr>
-        <w:pStyle w:val="Standard"/>
-      </w:pPr>
-    </w:p>
-    <w:p>
-      <w:pPr>
-        <w:pStyle w:val="Standard"/>
-      </w:pPr>
-      <w:r>
-        <w:t>========================================</w:t>
-      </w:r>
-    </w:p>
-    <w:p>
-      <w:pPr>
-        <w:pStyle w:val="Standard"/>
-      </w:pPr>
-      <w:r>
-        <w:rPr>
-          <w:rFonts w:ascii="Apple Color Emoji" w:hAnsi="Apple Color Emoji" w:cs="Apple Color Emoji"/>
-        </w:rPr>
-        <w:t>🏆</w:t>
-      </w:r>
-      <w:r>
-        <w:t xml:space="preserve"> ABSOLUTE BEST TRIAL </w:t>
-      </w:r>
-      <w:r>
-        <w:rPr>
-          <w:rFonts w:ascii="Apple Color Emoji" w:hAnsi="Apple Color Emoji" w:cs="Apple Color Emoji"/>
-        </w:rPr>
-        <w:t>🏆</w:t>
-      </w:r>
-    </w:p>
-    <w:p>
-      <w:pPr>
-        <w:pStyle w:val="Standard"/>
-      </w:pPr>
-      <w:r>
-        <w:t>========================================</w:t>
-      </w:r>
-    </w:p>
-    <w:p>
-      <w:pPr>
-        <w:pStyle w:val="Standard"/>
-      </w:pPr>
-      <w:r>
-        <w:t xml:space="preserve">Trial </w:t>
-      </w:r>
-      <w:proofErr w:type="gramStart"/>
-      <w:r>
-        <w:t>Number :</w:t>
-      </w:r>
-      <w:proofErr w:type="gramEnd"/>
-      <w:r>
-        <w:t xml:space="preserve"> 154</w:t>
-      </w:r>
-    </w:p>
-    <w:p>
-      <w:pPr>
-        <w:pStyle w:val="Standard"/>
-      </w:pPr>
-      <w:r>
-        <w:t xml:space="preserve">ITAE Cost  </w:t>
-      </w:r>
-      <w:proofErr w:type="gramStart"/>
-      <w:r>
-        <w:t xml:space="preserve">  :</w:t>
-      </w:r>
-      <w:proofErr w:type="gramEnd"/>
-      <w:r>
-        <w:t xml:space="preserve"> 48.7975</w:t>
-      </w:r>
-    </w:p>
-    <w:p>
-      <w:pPr>
-        <w:pStyle w:val="Standard"/>
-      </w:pPr>
-      <w:r>
-        <w:lastRenderedPageBreak/>
-        <w:t xml:space="preserve">Parameters </w:t>
-      </w:r>
-      <w:proofErr w:type="gramStart"/>
-      <w:r>
-        <w:t xml:space="preserve">  :</w:t>
-      </w:r>
-      <w:proofErr w:type="gramEnd"/>
-    </w:p>
-    <w:p>
-      <w:pPr>
-        <w:pStyle w:val="Standard"/>
-      </w:pPr>
-      <w:r>
-        <w:t xml:space="preserve">    </w:t>
-      </w:r>
-      <w:proofErr w:type="spellStart"/>
-      <w:r>
-        <w:t>initial_weight_scale_factor</w:t>
-      </w:r>
-      <w:proofErr w:type="spellEnd"/>
-      <w:r>
-        <w:t>: 0.2</w:t>
-      </w:r>
-    </w:p>
-    <w:p>
-      <w:pPr>
-        <w:pStyle w:val="Standard"/>
-      </w:pPr>
-      <w:r>
-        <w:t xml:space="preserve">    </w:t>
-      </w:r>
-      <w:proofErr w:type="spellStart"/>
-      <w:r>
-        <w:t>num_blocks</w:t>
-      </w:r>
-      <w:proofErr w:type="spellEnd"/>
-      <w:r>
-        <w:t>:</w:t>
-      </w:r>
-      <w:proofErr w:type="spellStart"/>
-      <w:r>
-        <w:t xml:space="preserve"> 4</w:t>
-      </w:r>
-    </w:p>
-    <w:p>
-      <w:pPr>
-        <w:pStyle w:val="Standard"/>
-      </w:pPr>
-      <w:r>
-        <w:t xml:space="preserve">    k_0</w:t>
-      </w:r>
-      <w:proofErr w:type="spellEnd"/>
-      <w:r>
-        <w:t>: 4</w:t>
+        <w:t xml:space="preserve">    k_0: 4</w:t>
       </w:r>
     </w:p>
     <w:p>

</xml_diff>